<commit_message>
added code description an deleted vial.cs
</commit_message>
<xml_diff>
--- a/description_of_implementation.docx
+++ b/description_of_implementation.docx
@@ -25,46 +25,39 @@
     </w:p>
     <w:p>
       <w:r>
-        <w:t xml:space="preserve">In this game, the player finds </w:t>
-      </w:r>
-      <w:r>
-        <w:t>themselves</w:t>
-      </w:r>
-      <w:r>
-        <w:t xml:space="preserve"> in an abandoned chemistry lab.</w:t>
-      </w:r>
-      <w:r>
-        <w:t xml:space="preserve"> </w:t>
-      </w:r>
-      <w:r>
-        <w:t>Around the room are various potions. The door is boarded up and various enemies</w:t>
-      </w:r>
-      <w:r>
-        <w:t xml:space="preserve"> </w:t>
-      </w:r>
-      <w:r>
-        <w:t>are trying to get in. It's up to the player to launch potions at the enemy to</w:t>
-      </w:r>
-      <w:r>
-        <w:t xml:space="preserve"> </w:t>
-      </w:r>
-      <w:r>
-        <w:t xml:space="preserve">defend </w:t>
-      </w:r>
-      <w:r>
-        <w:t>themselves</w:t>
-      </w:r>
-      <w:r>
-        <w:t>. The player can mix potions to create new ones that have different</w:t>
-      </w:r>
-      <w:r>
-        <w:t xml:space="preserve"> </w:t>
-      </w:r>
-      <w:r>
-        <w:t>properties when thrown at an enemy.</w:t>
-      </w:r>
-    </w:p>
-    <w:p/>
+        <w:t>In this game, the player finds themselves in an abandoned chemistry lab. Around the room are various potions. The door is boarded up and various enemies are trying to get in. It's up to the player to launch potions at the enemy to defend themselves. The player can mix potions to create new ones that have different properties when thrown at an enemy.</w:t>
+      </w:r>
+    </w:p>
+    <w:p>
+      <w:pPr>
+        <w:rPr>
+          <w:u w:val="single"/>
+        </w:rPr>
+      </w:pPr>
+      <w:r>
+        <w:rPr>
+          <w:u w:val="single"/>
+        </w:rPr>
+        <w:t>Project Link</w:t>
+      </w:r>
+    </w:p>
+    <w:p>
+      <w:hyperlink r:id="rId7" w:history="1">
+        <w:r>
+          <w:rPr>
+            <w:rStyle w:val="Hyperlink"/>
+          </w:rPr>
+          <w:t>https://github.com/Jasmine-Thind/vr-project</w:t>
+        </w:r>
+      </w:hyperlink>
+    </w:p>
+    <w:p>
+      <w:pPr>
+        <w:rPr>
+          <w:u w:val="single"/>
+        </w:rPr>
+      </w:pPr>
+    </w:p>
     <w:p>
       <w:pPr>
         <w:rPr>
@@ -80,13 +73,7 @@
     </w:p>
     <w:p>
       <w:r>
-        <w:t>Press A to teleport to the next hotspot, and press the hand trigger while</w:t>
-      </w:r>
-      <w:r>
-        <w:t xml:space="preserve"> </w:t>
-      </w:r>
-      <w:r>
-        <w:t>touching a potion to grab it. Throw and release the trigger to launch it.</w:t>
+        <w:t>Press A to teleport to the next hotspot, and press the hand trigger while touching a potion to grab it. Throw and release the trigger to launch it.</w:t>
       </w:r>
     </w:p>
     <w:p/>
@@ -141,7 +128,7 @@
       <w:r>
         <w:t xml:space="preserve">: </w:t>
       </w:r>
-      <w:hyperlink r:id="rId7" w:history="1">
+      <w:hyperlink r:id="rId8" w:history="1">
         <w:r>
           <w:rPr>
             <w:rStyle w:val="Hyperlink"/>
@@ -149,27 +136,7 @@
             <w:sz w:val="19"/>
             <w:szCs w:val="19"/>
           </w:rPr>
-          <w:t>https://www.patreon.com/posts</w:t>
-        </w:r>
-        <w:bookmarkStart w:id="0" w:name="_GoBack"/>
-        <w:bookmarkEnd w:id="0"/>
-        <w:r>
-          <w:rPr>
-            <w:rStyle w:val="Hyperlink"/>
-            <w:rFonts w:ascii="Cascadia Mono" w:hAnsi="Cascadia Mono" w:cs="Cascadia Mono"/>
-            <w:sz w:val="19"/>
-            <w:szCs w:val="19"/>
-          </w:rPr>
-          <w:t>/</w:t>
-        </w:r>
-        <w:r>
-          <w:rPr>
-            <w:rStyle w:val="Hyperlink"/>
-            <w:rFonts w:ascii="Cascadia Mono" w:hAnsi="Cascadia Mono" w:cs="Cascadia Mono"/>
-            <w:sz w:val="19"/>
-            <w:szCs w:val="19"/>
-          </w:rPr>
-          <w:t>18245226</w:t>
+          <w:t>https://www.patreon.com/posts/18245226</w:t>
         </w:r>
       </w:hyperlink>
     </w:p>
@@ -260,6 +227,7 @@
     <w:p>
       <w:proofErr w:type="spellStart"/>
       <w:r>
+        <w:lastRenderedPageBreak/>
         <w:t>PourPotion.cs</w:t>
       </w:r>
       <w:proofErr w:type="spellEnd"/>
@@ -267,14 +235,6 @@
     <w:p>
       <w:proofErr w:type="spellStart"/>
       <w:r>
-        <w:t>Vial.cs</w:t>
-      </w:r>
-      <w:proofErr w:type="spellEnd"/>
-    </w:p>
-    <w:p>
-      <w:proofErr w:type="spellStart"/>
-      <w:r>
-        <w:lastRenderedPageBreak/>
         <w:t>PotionLiquid.shader</w:t>
       </w:r>
       <w:proofErr w:type="spellEnd"/>
@@ -521,8 +481,335 @@
         <w:t>When the bottle collides, invoke a large stream of particles to act as the explosion of the potion</w:t>
       </w:r>
     </w:p>
+    <w:p/>
+    <w:p>
+      <w:proofErr w:type="spellStart"/>
+      <w:r>
+        <w:t>CountdownTimer.cs</w:t>
+      </w:r>
+      <w:proofErr w:type="spellEnd"/>
+    </w:p>
+    <w:p>
+      <w:pPr>
+        <w:pStyle w:val="ListParagraph"/>
+        <w:numPr>
+          <w:ilvl w:val="0"/>
+          <w:numId w:val="11"/>
+        </w:numPr>
+      </w:pPr>
+      <w:r>
+        <w:t>Displays a countdown timer in the player's view indicating time until the next enemy attack</w:t>
+      </w:r>
+    </w:p>
+    <w:p>
+      <w:pPr>
+        <w:pStyle w:val="ListParagraph"/>
+        <w:numPr>
+          <w:ilvl w:val="0"/>
+          <w:numId w:val="11"/>
+        </w:numPr>
+      </w:pPr>
+      <w:r>
+        <w:t>Timer resets after each enemy enters and disappears after the last enemy has entered</w:t>
+      </w:r>
+    </w:p>
+    <w:p/>
+    <w:p>
+      <w:proofErr w:type="spellStart"/>
+      <w:r>
+        <w:t>EnemyAttack.cs</w:t>
+      </w:r>
+      <w:proofErr w:type="spellEnd"/>
+    </w:p>
+    <w:p>
+      <w:pPr>
+        <w:pStyle w:val="ListParagraph"/>
+        <w:numPr>
+          <w:ilvl w:val="0"/>
+          <w:numId w:val="12"/>
+        </w:numPr>
+      </w:pPr>
+      <w:r>
+        <w:t>Handles damage dealt to the player when an enemy is in contact</w:t>
+      </w:r>
+    </w:p>
+    <w:p>
+      <w:pPr>
+        <w:pStyle w:val="ListParagraph"/>
+        <w:numPr>
+          <w:ilvl w:val="0"/>
+          <w:numId w:val="12"/>
+        </w:numPr>
+      </w:pPr>
+      <w:r>
+        <w:t>Reduces player health at a set rate while the player is within the enemy's trigger collider</w:t>
+      </w:r>
+    </w:p>
+    <w:p/>
+    <w:p>
+      <w:proofErr w:type="spellStart"/>
+      <w:r>
+        <w:t>EnemyBargesIn.cs</w:t>
+      </w:r>
+      <w:proofErr w:type="spellEnd"/>
+    </w:p>
+    <w:p>
+      <w:pPr>
+        <w:pStyle w:val="ListParagraph"/>
+        <w:numPr>
+          <w:ilvl w:val="0"/>
+          <w:numId w:val="13"/>
+        </w:numPr>
+      </w:pPr>
+      <w:r>
+        <w:t>Controls the full enemy entrance sequence after the timer expires</w:t>
+      </w:r>
+    </w:p>
+    <w:p>
+      <w:pPr>
+        <w:pStyle w:val="ListParagraph"/>
+        <w:numPr>
+          <w:ilvl w:val="0"/>
+          <w:numId w:val="13"/>
+        </w:numPr>
+      </w:pPr>
+      <w:r>
+        <w:t>Opens the door, moves the enemy to a designated endpoint, then closes the door</w:t>
+      </w:r>
+    </w:p>
+    <w:p>
+      <w:pPr>
+        <w:pStyle w:val="ListParagraph"/>
+        <w:numPr>
+          <w:ilvl w:val="0"/>
+          <w:numId w:val="13"/>
+        </w:numPr>
+      </w:pPr>
+      <w:r>
+        <w:t xml:space="preserve">Enables </w:t>
+      </w:r>
+      <w:proofErr w:type="spellStart"/>
+      <w:r>
+        <w:t>NavMesh</w:t>
+      </w:r>
+      <w:proofErr w:type="spellEnd"/>
+      <w:r>
+        <w:t xml:space="preserve"> chasing once the enemy reaches the endpoint</w:t>
+      </w:r>
+    </w:p>
+    <w:p>
+      <w:pPr>
+        <w:pStyle w:val="ListParagraph"/>
+        <w:numPr>
+          <w:ilvl w:val="0"/>
+          <w:numId w:val="13"/>
+        </w:numPr>
+      </w:pPr>
+      <w:r>
+        <w:t>Plays a door knock sound effect before the door opens</w:t>
+      </w:r>
+    </w:p>
+    <w:p/>
+    <w:p>
+      <w:proofErr w:type="spellStart"/>
+      <w:r>
+        <w:t>EnemyChase.cs</w:t>
+      </w:r>
+      <w:proofErr w:type="spellEnd"/>
+    </w:p>
+    <w:p>
+      <w:pPr>
+        <w:pStyle w:val="ListParagraph"/>
+        <w:numPr>
+          <w:ilvl w:val="0"/>
+          <w:numId w:val="14"/>
+        </w:numPr>
+      </w:pPr>
+      <w:r>
+        <w:t xml:space="preserve">Uses Unity's </w:t>
+      </w:r>
+      <w:proofErr w:type="spellStart"/>
+      <w:r>
+        <w:t>NavMesh</w:t>
+      </w:r>
+      <w:proofErr w:type="spellEnd"/>
+      <w:r>
+        <w:t xml:space="preserve"> AI to navigate the enemy toward the player's position</w:t>
+      </w:r>
+    </w:p>
+    <w:p>
+      <w:pPr>
+        <w:pStyle w:val="ListParagraph"/>
+        <w:numPr>
+          <w:ilvl w:val="0"/>
+          <w:numId w:val="14"/>
+        </w:numPr>
+      </w:pPr>
+      <w:r>
+        <w:t xml:space="preserve">Activated by </w:t>
+      </w:r>
+      <w:proofErr w:type="spellStart"/>
+      <w:r>
+        <w:t>EnemyBargesIn</w:t>
+      </w:r>
+      <w:proofErr w:type="spellEnd"/>
+      <w:r>
+        <w:t xml:space="preserve"> once the enemy has entered the room</w:t>
+      </w:r>
+    </w:p>
+    <w:p/>
+    <w:p>
+      <w:proofErr w:type="spellStart"/>
+      <w:r>
+        <w:t>EnemyHealth.cs</w:t>
+      </w:r>
+      <w:proofErr w:type="spellEnd"/>
+    </w:p>
+    <w:p/>
+    <w:p>
+      <w:pPr>
+        <w:pStyle w:val="ListParagraph"/>
+        <w:numPr>
+          <w:ilvl w:val="0"/>
+          <w:numId w:val="15"/>
+        </w:numPr>
+      </w:pPr>
+      <w:r>
+        <w:t>Tracks enemy state and handles the three potion effects</w:t>
+      </w:r>
+    </w:p>
+    <w:p>
+      <w:pPr>
+        <w:pStyle w:val="ListParagraph"/>
+        <w:numPr>
+          <w:ilvl w:val="0"/>
+          <w:numId w:val="15"/>
+        </w:numPr>
+      </w:pPr>
+      <w:r>
+        <w:t>Slows the enemy's movement speed for a duration when hit by the red potion</w:t>
+      </w:r>
+    </w:p>
+    <w:p>
+      <w:pPr>
+        <w:pStyle w:val="ListParagraph"/>
+        <w:numPr>
+          <w:ilvl w:val="0"/>
+          <w:numId w:val="15"/>
+        </w:numPr>
+      </w:pPr>
+      <w:r>
+        <w:t xml:space="preserve">Disables </w:t>
+      </w:r>
+      <w:proofErr w:type="spellStart"/>
+      <w:r>
+        <w:t>NavMesh</w:t>
+      </w:r>
+      <w:proofErr w:type="spellEnd"/>
+      <w:r>
+        <w:t xml:space="preserve"> rotation and spins the enemy when hit by the green potion</w:t>
+      </w:r>
+    </w:p>
+    <w:p>
+      <w:pPr>
+        <w:pStyle w:val="ListParagraph"/>
+        <w:numPr>
+          <w:ilvl w:val="0"/>
+          <w:numId w:val="15"/>
+        </w:numPr>
+      </w:pPr>
+      <w:r>
+        <w:t>Destroys the enemy immediately when hit by the mixed potion</w:t>
+      </w:r>
+    </w:p>
+    <w:p/>
+    <w:p>
+      <w:proofErr w:type="spellStart"/>
+      <w:r>
+        <w:t>GameOver.cs</w:t>
+      </w:r>
+      <w:bookmarkStart w:id="0" w:name="_GoBack"/>
+      <w:bookmarkEnd w:id="0"/>
+      <w:proofErr w:type="spellEnd"/>
+    </w:p>
+    <w:p>
+      <w:pPr>
+        <w:pStyle w:val="ListParagraph"/>
+        <w:numPr>
+          <w:ilvl w:val="0"/>
+          <w:numId w:val="16"/>
+        </w:numPr>
+      </w:pPr>
+      <w:r>
+        <w:t>Displays a game over screen when the player's health reaches zero</w:t>
+      </w:r>
+    </w:p>
+    <w:p>
+      <w:pPr>
+        <w:pStyle w:val="ListParagraph"/>
+        <w:numPr>
+          <w:ilvl w:val="0"/>
+          <w:numId w:val="16"/>
+        </w:numPr>
+      </w:pPr>
+      <w:r>
+        <w:t>Freezes the game and automatically restarts the scene after a short delay</w:t>
+      </w:r>
+    </w:p>
+    <w:p/>
+    <w:p>
+      <w:proofErr w:type="spellStart"/>
+      <w:r>
+        <w:t>PlayerHealth.cs</w:t>
+      </w:r>
+      <w:proofErr w:type="spellEnd"/>
+    </w:p>
+    <w:p>
+      <w:pPr>
+        <w:pStyle w:val="ListParagraph"/>
+        <w:numPr>
+          <w:ilvl w:val="0"/>
+          <w:numId w:val="17"/>
+        </w:numPr>
+      </w:pPr>
+      <w:r>
+        <w:t>Tracks the player's health and reduces it when taking damage from enemies</w:t>
+      </w:r>
+    </w:p>
+    <w:p>
+      <w:pPr>
+        <w:pStyle w:val="ListParagraph"/>
+        <w:numPr>
+          <w:ilvl w:val="0"/>
+          <w:numId w:val="17"/>
+        </w:numPr>
+      </w:pPr>
+      <w:r>
+        <w:t>Updates a red screen overlay that becomes more intense as health decreases</w:t>
+      </w:r>
+    </w:p>
+    <w:p>
+      <w:pPr>
+        <w:pStyle w:val="ListParagraph"/>
+        <w:numPr>
+          <w:ilvl w:val="0"/>
+          <w:numId w:val="17"/>
+        </w:numPr>
+      </w:pPr>
+      <w:r>
+        <w:t xml:space="preserve">Triggers the </w:t>
+      </w:r>
+      <w:proofErr w:type="spellStart"/>
+      <w:r>
+        <w:t>GameOver</w:t>
+      </w:r>
+      <w:proofErr w:type="spellEnd"/>
+      <w:r>
+        <w:t xml:space="preserve"> script when health reaches zero</w:t>
+      </w:r>
+    </w:p>
     <w:sectPr>
-      <w:headerReference w:type="default" r:id="rId8"/>
+      <w:headerReference w:type="default" r:id="rId9"/>
       <w:pgSz w:w="12240" w:h="15840"/>
       <w:pgMar w:top="1440" w:right="1440" w:bottom="1440" w:left="1440" w:header="708" w:footer="708" w:gutter="0"/>
       <w:cols w:space="708"/>
@@ -624,6 +911,119 @@
 <file path=word/numbering.xml><?xml version="1.0" encoding="utf-8"?>
 <w:numbering xmlns:wpc="http://schemas.microsoft.com/office/word/2010/wordprocessingCanvas" xmlns:cx="http://schemas.microsoft.com/office/drawing/2014/chartex" xmlns:cx1="http://schemas.microsoft.com/office/drawing/2015/9/8/chartex" xmlns:cx2="http://schemas.microsoft.com/office/drawing/2015/10/21/chartex" xmlns:cx3="http://schemas.microsoft.com/office/drawing/2016/5/9/chartex" xmlns:cx4="http://schemas.microsoft.com/office/drawing/2016/5/10/chartex" xmlns:cx5="http://schemas.microsoft.com/office/drawing/2016/5/11/chartex" xmlns:cx6="http://schemas.microsoft.com/office/drawing/2016/5/12/chartex" xmlns:cx7="http://schemas.microsoft.com/office/drawing/2016/5/13/chartex" xmlns:cx8="http://schemas.microsoft.com/office/drawing/2016/5/14/chartex" xmlns:mc="http://schemas.openxmlformats.org/markup-compatibility/2006" xmlns:aink="http://schemas.microsoft.com/office/drawing/2016/ink" xmlns:am3d="http://schemas.microsoft.com/office/drawing/2017/model3d" xmlns:o="urn:schemas-microsoft-com:office:office" xmlns:r="http://schemas.openxmlformats.org/officeDocument/2006/relationships" xmlns:m="http://schemas.openxmlformats.org/officeDocument/2006/math" xmlns:v="urn:schemas-microsoft-com:vml" xmlns:wp14="http://schemas.microsoft.com/office/word/2010/wordprocessingDrawing" xmlns:wp="http://schemas.openxmlformats.org/drawingml/2006/wordprocessingDrawing" xmlns:w10="urn:schemas-microsoft-com:office:word" xmlns:w="http://schemas.openxmlformats.org/wordprocessingml/2006/main" xmlns:w14="http://schemas.microsoft.com/office/word/2010/wordml" xmlns:w15="http://schemas.microsoft.com/office/word/2012/wordml" xmlns:w16cid="http://schemas.microsoft.com/office/word/2016/wordml/cid" xmlns:w16se="http://schemas.microsoft.com/office/word/2015/wordml/symex" xmlns:wpg="http://schemas.microsoft.com/office/word/2010/wordprocessingGroup" xmlns:wpi="http://schemas.microsoft.com/office/word/2010/wordprocessingInk" xmlns:wne="http://schemas.microsoft.com/office/word/2006/wordml" xmlns:wps="http://schemas.microsoft.com/office/word/2010/wordprocessingShape" mc:Ignorable="w14 w15 w16se w16cid wp14">
   <w:abstractNum w:abstractNumId="0" w15:restartNumberingAfterBreak="0">
+    <w:nsid w:val="045B494E"/>
+    <w:multiLevelType w:val="hybridMultilevel"/>
+    <w:tmpl w:val="1664811C"/>
+    <w:lvl w:ilvl="0" w:tplc="10090001">
+      <w:start w:val="1"/>
+      <w:numFmt w:val="bullet"/>
+      <w:lvlText w:val=""/>
+      <w:lvlJc w:val="left"/>
+      <w:pPr>
+        <w:ind w:left="720" w:hanging="360"/>
+      </w:pPr>
+      <w:rPr>
+        <w:rFonts w:ascii="Symbol" w:hAnsi="Symbol" w:hint="default"/>
+      </w:rPr>
+    </w:lvl>
+    <w:lvl w:ilvl="1" w:tplc="10090003" w:tentative="1">
+      <w:start w:val="1"/>
+      <w:numFmt w:val="bullet"/>
+      <w:lvlText w:val="o"/>
+      <w:lvlJc w:val="left"/>
+      <w:pPr>
+        <w:ind w:left="1440" w:hanging="360"/>
+      </w:pPr>
+      <w:rPr>
+        <w:rFonts w:ascii="Courier New" w:hAnsi="Courier New" w:cs="Courier New" w:hint="default"/>
+      </w:rPr>
+    </w:lvl>
+    <w:lvl w:ilvl="2" w:tplc="10090005" w:tentative="1">
+      <w:start w:val="1"/>
+      <w:numFmt w:val="bullet"/>
+      <w:lvlText w:val=""/>
+      <w:lvlJc w:val="left"/>
+      <w:pPr>
+        <w:ind w:left="2160" w:hanging="360"/>
+      </w:pPr>
+      <w:rPr>
+        <w:rFonts w:ascii="Wingdings" w:hAnsi="Wingdings" w:hint="default"/>
+      </w:rPr>
+    </w:lvl>
+    <w:lvl w:ilvl="3" w:tplc="10090001" w:tentative="1">
+      <w:start w:val="1"/>
+      <w:numFmt w:val="bullet"/>
+      <w:lvlText w:val=""/>
+      <w:lvlJc w:val="left"/>
+      <w:pPr>
+        <w:ind w:left="2880" w:hanging="360"/>
+      </w:pPr>
+      <w:rPr>
+        <w:rFonts w:ascii="Symbol" w:hAnsi="Symbol" w:hint="default"/>
+      </w:rPr>
+    </w:lvl>
+    <w:lvl w:ilvl="4" w:tplc="10090003" w:tentative="1">
+      <w:start w:val="1"/>
+      <w:numFmt w:val="bullet"/>
+      <w:lvlText w:val="o"/>
+      <w:lvlJc w:val="left"/>
+      <w:pPr>
+        <w:ind w:left="3600" w:hanging="360"/>
+      </w:pPr>
+      <w:rPr>
+        <w:rFonts w:ascii="Courier New" w:hAnsi="Courier New" w:cs="Courier New" w:hint="default"/>
+      </w:rPr>
+    </w:lvl>
+    <w:lvl w:ilvl="5" w:tplc="10090005" w:tentative="1">
+      <w:start w:val="1"/>
+      <w:numFmt w:val="bullet"/>
+      <w:lvlText w:val=""/>
+      <w:lvlJc w:val="left"/>
+      <w:pPr>
+        <w:ind w:left="4320" w:hanging="360"/>
+      </w:pPr>
+      <w:rPr>
+        <w:rFonts w:ascii="Wingdings" w:hAnsi="Wingdings" w:hint="default"/>
+      </w:rPr>
+    </w:lvl>
+    <w:lvl w:ilvl="6" w:tplc="10090001" w:tentative="1">
+      <w:start w:val="1"/>
+      <w:numFmt w:val="bullet"/>
+      <w:lvlText w:val=""/>
+      <w:lvlJc w:val="left"/>
+      <w:pPr>
+        <w:ind w:left="5040" w:hanging="360"/>
+      </w:pPr>
+      <w:rPr>
+        <w:rFonts w:ascii="Symbol" w:hAnsi="Symbol" w:hint="default"/>
+      </w:rPr>
+    </w:lvl>
+    <w:lvl w:ilvl="7" w:tplc="10090003" w:tentative="1">
+      <w:start w:val="1"/>
+      <w:numFmt w:val="bullet"/>
+      <w:lvlText w:val="o"/>
+      <w:lvlJc w:val="left"/>
+      <w:pPr>
+        <w:ind w:left="5760" w:hanging="360"/>
+      </w:pPr>
+      <w:rPr>
+        <w:rFonts w:ascii="Courier New" w:hAnsi="Courier New" w:cs="Courier New" w:hint="default"/>
+      </w:rPr>
+    </w:lvl>
+    <w:lvl w:ilvl="8" w:tplc="10090005" w:tentative="1">
+      <w:start w:val="1"/>
+      <w:numFmt w:val="bullet"/>
+      <w:lvlText w:val=""/>
+      <w:lvlJc w:val="left"/>
+      <w:pPr>
+        <w:ind w:left="6480" w:hanging="360"/>
+      </w:pPr>
+      <w:rPr>
+        <w:rFonts w:ascii="Wingdings" w:hAnsi="Wingdings" w:hint="default"/>
+      </w:rPr>
+    </w:lvl>
+  </w:abstractNum>
+  <w:abstractNum w:abstractNumId="1" w15:restartNumberingAfterBreak="0">
     <w:nsid w:val="149B2E98"/>
     <w:multiLevelType w:val="hybridMultilevel"/>
     <w:tmpl w:val="5D90D3CE"/>
@@ -736,7 +1136,7 @@
       </w:rPr>
     </w:lvl>
   </w:abstractNum>
-  <w:abstractNum w:abstractNumId="1" w15:restartNumberingAfterBreak="0">
+  <w:abstractNum w:abstractNumId="2" w15:restartNumberingAfterBreak="0">
     <w:nsid w:val="1DA33724"/>
     <w:multiLevelType w:val="hybridMultilevel"/>
     <w:tmpl w:val="28DE13EA"/>
@@ -849,7 +1249,7 @@
       </w:rPr>
     </w:lvl>
   </w:abstractNum>
-  <w:abstractNum w:abstractNumId="2" w15:restartNumberingAfterBreak="0">
+  <w:abstractNum w:abstractNumId="3" w15:restartNumberingAfterBreak="0">
     <w:nsid w:val="28BE2BD4"/>
     <w:multiLevelType w:val="hybridMultilevel"/>
     <w:tmpl w:val="58AAC58E"/>
@@ -961,7 +1361,120 @@
       </w:rPr>
     </w:lvl>
   </w:abstractNum>
-  <w:abstractNum w:abstractNumId="3" w15:restartNumberingAfterBreak="0">
+  <w:abstractNum w:abstractNumId="4" w15:restartNumberingAfterBreak="0">
+    <w:nsid w:val="29D63332"/>
+    <w:multiLevelType w:val="hybridMultilevel"/>
+    <w:tmpl w:val="6C0A19B2"/>
+    <w:lvl w:ilvl="0" w:tplc="10090001">
+      <w:start w:val="1"/>
+      <w:numFmt w:val="bullet"/>
+      <w:lvlText w:val=""/>
+      <w:lvlJc w:val="left"/>
+      <w:pPr>
+        <w:ind w:left="720" w:hanging="360"/>
+      </w:pPr>
+      <w:rPr>
+        <w:rFonts w:ascii="Symbol" w:hAnsi="Symbol" w:hint="default"/>
+      </w:rPr>
+    </w:lvl>
+    <w:lvl w:ilvl="1" w:tplc="10090003" w:tentative="1">
+      <w:start w:val="1"/>
+      <w:numFmt w:val="bullet"/>
+      <w:lvlText w:val="o"/>
+      <w:lvlJc w:val="left"/>
+      <w:pPr>
+        <w:ind w:left="1440" w:hanging="360"/>
+      </w:pPr>
+      <w:rPr>
+        <w:rFonts w:ascii="Courier New" w:hAnsi="Courier New" w:cs="Courier New" w:hint="default"/>
+      </w:rPr>
+    </w:lvl>
+    <w:lvl w:ilvl="2" w:tplc="10090005" w:tentative="1">
+      <w:start w:val="1"/>
+      <w:numFmt w:val="bullet"/>
+      <w:lvlText w:val=""/>
+      <w:lvlJc w:val="left"/>
+      <w:pPr>
+        <w:ind w:left="2160" w:hanging="360"/>
+      </w:pPr>
+      <w:rPr>
+        <w:rFonts w:ascii="Wingdings" w:hAnsi="Wingdings" w:hint="default"/>
+      </w:rPr>
+    </w:lvl>
+    <w:lvl w:ilvl="3" w:tplc="10090001" w:tentative="1">
+      <w:start w:val="1"/>
+      <w:numFmt w:val="bullet"/>
+      <w:lvlText w:val=""/>
+      <w:lvlJc w:val="left"/>
+      <w:pPr>
+        <w:ind w:left="2880" w:hanging="360"/>
+      </w:pPr>
+      <w:rPr>
+        <w:rFonts w:ascii="Symbol" w:hAnsi="Symbol" w:hint="default"/>
+      </w:rPr>
+    </w:lvl>
+    <w:lvl w:ilvl="4" w:tplc="10090003" w:tentative="1">
+      <w:start w:val="1"/>
+      <w:numFmt w:val="bullet"/>
+      <w:lvlText w:val="o"/>
+      <w:lvlJc w:val="left"/>
+      <w:pPr>
+        <w:ind w:left="3600" w:hanging="360"/>
+      </w:pPr>
+      <w:rPr>
+        <w:rFonts w:ascii="Courier New" w:hAnsi="Courier New" w:cs="Courier New" w:hint="default"/>
+      </w:rPr>
+    </w:lvl>
+    <w:lvl w:ilvl="5" w:tplc="10090005" w:tentative="1">
+      <w:start w:val="1"/>
+      <w:numFmt w:val="bullet"/>
+      <w:lvlText w:val=""/>
+      <w:lvlJc w:val="left"/>
+      <w:pPr>
+        <w:ind w:left="4320" w:hanging="360"/>
+      </w:pPr>
+      <w:rPr>
+        <w:rFonts w:ascii="Wingdings" w:hAnsi="Wingdings" w:hint="default"/>
+      </w:rPr>
+    </w:lvl>
+    <w:lvl w:ilvl="6" w:tplc="10090001" w:tentative="1">
+      <w:start w:val="1"/>
+      <w:numFmt w:val="bullet"/>
+      <w:lvlText w:val=""/>
+      <w:lvlJc w:val="left"/>
+      <w:pPr>
+        <w:ind w:left="5040" w:hanging="360"/>
+      </w:pPr>
+      <w:rPr>
+        <w:rFonts w:ascii="Symbol" w:hAnsi="Symbol" w:hint="default"/>
+      </w:rPr>
+    </w:lvl>
+    <w:lvl w:ilvl="7" w:tplc="10090003" w:tentative="1">
+      <w:start w:val="1"/>
+      <w:numFmt w:val="bullet"/>
+      <w:lvlText w:val="o"/>
+      <w:lvlJc w:val="left"/>
+      <w:pPr>
+        <w:ind w:left="5760" w:hanging="360"/>
+      </w:pPr>
+      <w:rPr>
+        <w:rFonts w:ascii="Courier New" w:hAnsi="Courier New" w:cs="Courier New" w:hint="default"/>
+      </w:rPr>
+    </w:lvl>
+    <w:lvl w:ilvl="8" w:tplc="10090005" w:tentative="1">
+      <w:start w:val="1"/>
+      <w:numFmt w:val="bullet"/>
+      <w:lvlText w:val=""/>
+      <w:lvlJc w:val="left"/>
+      <w:pPr>
+        <w:ind w:left="6480" w:hanging="360"/>
+      </w:pPr>
+      <w:rPr>
+        <w:rFonts w:ascii="Wingdings" w:hAnsi="Wingdings" w:hint="default"/>
+      </w:rPr>
+    </w:lvl>
+  </w:abstractNum>
+  <w:abstractNum w:abstractNumId="5" w15:restartNumberingAfterBreak="0">
     <w:nsid w:val="2AFF3472"/>
     <w:multiLevelType w:val="hybridMultilevel"/>
     <w:tmpl w:val="6F1ACB90"/>
@@ -1074,7 +1587,7 @@
       </w:rPr>
     </w:lvl>
   </w:abstractNum>
-  <w:abstractNum w:abstractNumId="4" w15:restartNumberingAfterBreak="0">
+  <w:abstractNum w:abstractNumId="6" w15:restartNumberingAfterBreak="0">
     <w:nsid w:val="2CA616FB"/>
     <w:multiLevelType w:val="hybridMultilevel"/>
     <w:tmpl w:val="3B30EE2C"/>
@@ -1186,7 +1699,120 @@
       </w:rPr>
     </w:lvl>
   </w:abstractNum>
-  <w:abstractNum w:abstractNumId="5" w15:restartNumberingAfterBreak="0">
+  <w:abstractNum w:abstractNumId="7" w15:restartNumberingAfterBreak="0">
+    <w:nsid w:val="374810B9"/>
+    <w:multiLevelType w:val="hybridMultilevel"/>
+    <w:tmpl w:val="57FE09DE"/>
+    <w:lvl w:ilvl="0" w:tplc="10090001">
+      <w:start w:val="1"/>
+      <w:numFmt w:val="bullet"/>
+      <w:lvlText w:val=""/>
+      <w:lvlJc w:val="left"/>
+      <w:pPr>
+        <w:ind w:left="720" w:hanging="360"/>
+      </w:pPr>
+      <w:rPr>
+        <w:rFonts w:ascii="Symbol" w:hAnsi="Symbol" w:hint="default"/>
+      </w:rPr>
+    </w:lvl>
+    <w:lvl w:ilvl="1" w:tplc="10090003" w:tentative="1">
+      <w:start w:val="1"/>
+      <w:numFmt w:val="bullet"/>
+      <w:lvlText w:val="o"/>
+      <w:lvlJc w:val="left"/>
+      <w:pPr>
+        <w:ind w:left="1440" w:hanging="360"/>
+      </w:pPr>
+      <w:rPr>
+        <w:rFonts w:ascii="Courier New" w:hAnsi="Courier New" w:cs="Courier New" w:hint="default"/>
+      </w:rPr>
+    </w:lvl>
+    <w:lvl w:ilvl="2" w:tplc="10090005" w:tentative="1">
+      <w:start w:val="1"/>
+      <w:numFmt w:val="bullet"/>
+      <w:lvlText w:val=""/>
+      <w:lvlJc w:val="left"/>
+      <w:pPr>
+        <w:ind w:left="2160" w:hanging="360"/>
+      </w:pPr>
+      <w:rPr>
+        <w:rFonts w:ascii="Wingdings" w:hAnsi="Wingdings" w:hint="default"/>
+      </w:rPr>
+    </w:lvl>
+    <w:lvl w:ilvl="3" w:tplc="10090001" w:tentative="1">
+      <w:start w:val="1"/>
+      <w:numFmt w:val="bullet"/>
+      <w:lvlText w:val=""/>
+      <w:lvlJc w:val="left"/>
+      <w:pPr>
+        <w:ind w:left="2880" w:hanging="360"/>
+      </w:pPr>
+      <w:rPr>
+        <w:rFonts w:ascii="Symbol" w:hAnsi="Symbol" w:hint="default"/>
+      </w:rPr>
+    </w:lvl>
+    <w:lvl w:ilvl="4" w:tplc="10090003" w:tentative="1">
+      <w:start w:val="1"/>
+      <w:numFmt w:val="bullet"/>
+      <w:lvlText w:val="o"/>
+      <w:lvlJc w:val="left"/>
+      <w:pPr>
+        <w:ind w:left="3600" w:hanging="360"/>
+      </w:pPr>
+      <w:rPr>
+        <w:rFonts w:ascii="Courier New" w:hAnsi="Courier New" w:cs="Courier New" w:hint="default"/>
+      </w:rPr>
+    </w:lvl>
+    <w:lvl w:ilvl="5" w:tplc="10090005" w:tentative="1">
+      <w:start w:val="1"/>
+      <w:numFmt w:val="bullet"/>
+      <w:lvlText w:val=""/>
+      <w:lvlJc w:val="left"/>
+      <w:pPr>
+        <w:ind w:left="4320" w:hanging="360"/>
+      </w:pPr>
+      <w:rPr>
+        <w:rFonts w:ascii="Wingdings" w:hAnsi="Wingdings" w:hint="default"/>
+      </w:rPr>
+    </w:lvl>
+    <w:lvl w:ilvl="6" w:tplc="10090001" w:tentative="1">
+      <w:start w:val="1"/>
+      <w:numFmt w:val="bullet"/>
+      <w:lvlText w:val=""/>
+      <w:lvlJc w:val="left"/>
+      <w:pPr>
+        <w:ind w:left="5040" w:hanging="360"/>
+      </w:pPr>
+      <w:rPr>
+        <w:rFonts w:ascii="Symbol" w:hAnsi="Symbol" w:hint="default"/>
+      </w:rPr>
+    </w:lvl>
+    <w:lvl w:ilvl="7" w:tplc="10090003" w:tentative="1">
+      <w:start w:val="1"/>
+      <w:numFmt w:val="bullet"/>
+      <w:lvlText w:val="o"/>
+      <w:lvlJc w:val="left"/>
+      <w:pPr>
+        <w:ind w:left="5760" w:hanging="360"/>
+      </w:pPr>
+      <w:rPr>
+        <w:rFonts w:ascii="Courier New" w:hAnsi="Courier New" w:cs="Courier New" w:hint="default"/>
+      </w:rPr>
+    </w:lvl>
+    <w:lvl w:ilvl="8" w:tplc="10090005" w:tentative="1">
+      <w:start w:val="1"/>
+      <w:numFmt w:val="bullet"/>
+      <w:lvlText w:val=""/>
+      <w:lvlJc w:val="left"/>
+      <w:pPr>
+        <w:ind w:left="6480" w:hanging="360"/>
+      </w:pPr>
+      <w:rPr>
+        <w:rFonts w:ascii="Wingdings" w:hAnsi="Wingdings" w:hint="default"/>
+      </w:rPr>
+    </w:lvl>
+  </w:abstractNum>
+  <w:abstractNum w:abstractNumId="8" w15:restartNumberingAfterBreak="0">
     <w:nsid w:val="3E7546F5"/>
     <w:multiLevelType w:val="hybridMultilevel"/>
     <w:tmpl w:val="909E7E3C"/>
@@ -1298,7 +1924,120 @@
       </w:rPr>
     </w:lvl>
   </w:abstractNum>
-  <w:abstractNum w:abstractNumId="6" w15:restartNumberingAfterBreak="0">
+  <w:abstractNum w:abstractNumId="9" w15:restartNumberingAfterBreak="0">
+    <w:nsid w:val="41E65408"/>
+    <w:multiLevelType w:val="hybridMultilevel"/>
+    <w:tmpl w:val="050038C6"/>
+    <w:lvl w:ilvl="0" w:tplc="10090001">
+      <w:start w:val="1"/>
+      <w:numFmt w:val="bullet"/>
+      <w:lvlText w:val=""/>
+      <w:lvlJc w:val="left"/>
+      <w:pPr>
+        <w:ind w:left="720" w:hanging="360"/>
+      </w:pPr>
+      <w:rPr>
+        <w:rFonts w:ascii="Symbol" w:hAnsi="Symbol" w:hint="default"/>
+      </w:rPr>
+    </w:lvl>
+    <w:lvl w:ilvl="1" w:tplc="10090003" w:tentative="1">
+      <w:start w:val="1"/>
+      <w:numFmt w:val="bullet"/>
+      <w:lvlText w:val="o"/>
+      <w:lvlJc w:val="left"/>
+      <w:pPr>
+        <w:ind w:left="1440" w:hanging="360"/>
+      </w:pPr>
+      <w:rPr>
+        <w:rFonts w:ascii="Courier New" w:hAnsi="Courier New" w:cs="Courier New" w:hint="default"/>
+      </w:rPr>
+    </w:lvl>
+    <w:lvl w:ilvl="2" w:tplc="10090005" w:tentative="1">
+      <w:start w:val="1"/>
+      <w:numFmt w:val="bullet"/>
+      <w:lvlText w:val=""/>
+      <w:lvlJc w:val="left"/>
+      <w:pPr>
+        <w:ind w:left="2160" w:hanging="360"/>
+      </w:pPr>
+      <w:rPr>
+        <w:rFonts w:ascii="Wingdings" w:hAnsi="Wingdings" w:hint="default"/>
+      </w:rPr>
+    </w:lvl>
+    <w:lvl w:ilvl="3" w:tplc="10090001" w:tentative="1">
+      <w:start w:val="1"/>
+      <w:numFmt w:val="bullet"/>
+      <w:lvlText w:val=""/>
+      <w:lvlJc w:val="left"/>
+      <w:pPr>
+        <w:ind w:left="2880" w:hanging="360"/>
+      </w:pPr>
+      <w:rPr>
+        <w:rFonts w:ascii="Symbol" w:hAnsi="Symbol" w:hint="default"/>
+      </w:rPr>
+    </w:lvl>
+    <w:lvl w:ilvl="4" w:tplc="10090003" w:tentative="1">
+      <w:start w:val="1"/>
+      <w:numFmt w:val="bullet"/>
+      <w:lvlText w:val="o"/>
+      <w:lvlJc w:val="left"/>
+      <w:pPr>
+        <w:ind w:left="3600" w:hanging="360"/>
+      </w:pPr>
+      <w:rPr>
+        <w:rFonts w:ascii="Courier New" w:hAnsi="Courier New" w:cs="Courier New" w:hint="default"/>
+      </w:rPr>
+    </w:lvl>
+    <w:lvl w:ilvl="5" w:tplc="10090005" w:tentative="1">
+      <w:start w:val="1"/>
+      <w:numFmt w:val="bullet"/>
+      <w:lvlText w:val=""/>
+      <w:lvlJc w:val="left"/>
+      <w:pPr>
+        <w:ind w:left="4320" w:hanging="360"/>
+      </w:pPr>
+      <w:rPr>
+        <w:rFonts w:ascii="Wingdings" w:hAnsi="Wingdings" w:hint="default"/>
+      </w:rPr>
+    </w:lvl>
+    <w:lvl w:ilvl="6" w:tplc="10090001" w:tentative="1">
+      <w:start w:val="1"/>
+      <w:numFmt w:val="bullet"/>
+      <w:lvlText w:val=""/>
+      <w:lvlJc w:val="left"/>
+      <w:pPr>
+        <w:ind w:left="5040" w:hanging="360"/>
+      </w:pPr>
+      <w:rPr>
+        <w:rFonts w:ascii="Symbol" w:hAnsi="Symbol" w:hint="default"/>
+      </w:rPr>
+    </w:lvl>
+    <w:lvl w:ilvl="7" w:tplc="10090003" w:tentative="1">
+      <w:start w:val="1"/>
+      <w:numFmt w:val="bullet"/>
+      <w:lvlText w:val="o"/>
+      <w:lvlJc w:val="left"/>
+      <w:pPr>
+        <w:ind w:left="5760" w:hanging="360"/>
+      </w:pPr>
+      <w:rPr>
+        <w:rFonts w:ascii="Courier New" w:hAnsi="Courier New" w:cs="Courier New" w:hint="default"/>
+      </w:rPr>
+    </w:lvl>
+    <w:lvl w:ilvl="8" w:tplc="10090005" w:tentative="1">
+      <w:start w:val="1"/>
+      <w:numFmt w:val="bullet"/>
+      <w:lvlText w:val=""/>
+      <w:lvlJc w:val="left"/>
+      <w:pPr>
+        <w:ind w:left="6480" w:hanging="360"/>
+      </w:pPr>
+      <w:rPr>
+        <w:rFonts w:ascii="Wingdings" w:hAnsi="Wingdings" w:hint="default"/>
+      </w:rPr>
+    </w:lvl>
+  </w:abstractNum>
+  <w:abstractNum w:abstractNumId="10" w15:restartNumberingAfterBreak="0">
     <w:nsid w:val="65497885"/>
     <w:multiLevelType w:val="hybridMultilevel"/>
     <w:tmpl w:val="CD220C72"/>
@@ -1410,7 +2149,346 @@
       </w:rPr>
     </w:lvl>
   </w:abstractNum>
-  <w:abstractNum w:abstractNumId="7" w15:restartNumberingAfterBreak="0">
+  <w:abstractNum w:abstractNumId="11" w15:restartNumberingAfterBreak="0">
+    <w:nsid w:val="654A050E"/>
+    <w:multiLevelType w:val="hybridMultilevel"/>
+    <w:tmpl w:val="483ED0E0"/>
+    <w:lvl w:ilvl="0" w:tplc="10090001">
+      <w:start w:val="1"/>
+      <w:numFmt w:val="bullet"/>
+      <w:lvlText w:val=""/>
+      <w:lvlJc w:val="left"/>
+      <w:pPr>
+        <w:ind w:left="720" w:hanging="360"/>
+      </w:pPr>
+      <w:rPr>
+        <w:rFonts w:ascii="Symbol" w:hAnsi="Symbol" w:hint="default"/>
+      </w:rPr>
+    </w:lvl>
+    <w:lvl w:ilvl="1" w:tplc="10090003" w:tentative="1">
+      <w:start w:val="1"/>
+      <w:numFmt w:val="bullet"/>
+      <w:lvlText w:val="o"/>
+      <w:lvlJc w:val="left"/>
+      <w:pPr>
+        <w:ind w:left="1440" w:hanging="360"/>
+      </w:pPr>
+      <w:rPr>
+        <w:rFonts w:ascii="Courier New" w:hAnsi="Courier New" w:cs="Courier New" w:hint="default"/>
+      </w:rPr>
+    </w:lvl>
+    <w:lvl w:ilvl="2" w:tplc="10090005" w:tentative="1">
+      <w:start w:val="1"/>
+      <w:numFmt w:val="bullet"/>
+      <w:lvlText w:val=""/>
+      <w:lvlJc w:val="left"/>
+      <w:pPr>
+        <w:ind w:left="2160" w:hanging="360"/>
+      </w:pPr>
+      <w:rPr>
+        <w:rFonts w:ascii="Wingdings" w:hAnsi="Wingdings" w:hint="default"/>
+      </w:rPr>
+    </w:lvl>
+    <w:lvl w:ilvl="3" w:tplc="10090001" w:tentative="1">
+      <w:start w:val="1"/>
+      <w:numFmt w:val="bullet"/>
+      <w:lvlText w:val=""/>
+      <w:lvlJc w:val="left"/>
+      <w:pPr>
+        <w:ind w:left="2880" w:hanging="360"/>
+      </w:pPr>
+      <w:rPr>
+        <w:rFonts w:ascii="Symbol" w:hAnsi="Symbol" w:hint="default"/>
+      </w:rPr>
+    </w:lvl>
+    <w:lvl w:ilvl="4" w:tplc="10090003" w:tentative="1">
+      <w:start w:val="1"/>
+      <w:numFmt w:val="bullet"/>
+      <w:lvlText w:val="o"/>
+      <w:lvlJc w:val="left"/>
+      <w:pPr>
+        <w:ind w:left="3600" w:hanging="360"/>
+      </w:pPr>
+      <w:rPr>
+        <w:rFonts w:ascii="Courier New" w:hAnsi="Courier New" w:cs="Courier New" w:hint="default"/>
+      </w:rPr>
+    </w:lvl>
+    <w:lvl w:ilvl="5" w:tplc="10090005" w:tentative="1">
+      <w:start w:val="1"/>
+      <w:numFmt w:val="bullet"/>
+      <w:lvlText w:val=""/>
+      <w:lvlJc w:val="left"/>
+      <w:pPr>
+        <w:ind w:left="4320" w:hanging="360"/>
+      </w:pPr>
+      <w:rPr>
+        <w:rFonts w:ascii="Wingdings" w:hAnsi="Wingdings" w:hint="default"/>
+      </w:rPr>
+    </w:lvl>
+    <w:lvl w:ilvl="6" w:tplc="10090001" w:tentative="1">
+      <w:start w:val="1"/>
+      <w:numFmt w:val="bullet"/>
+      <w:lvlText w:val=""/>
+      <w:lvlJc w:val="left"/>
+      <w:pPr>
+        <w:ind w:left="5040" w:hanging="360"/>
+      </w:pPr>
+      <w:rPr>
+        <w:rFonts w:ascii="Symbol" w:hAnsi="Symbol" w:hint="default"/>
+      </w:rPr>
+    </w:lvl>
+    <w:lvl w:ilvl="7" w:tplc="10090003" w:tentative="1">
+      <w:start w:val="1"/>
+      <w:numFmt w:val="bullet"/>
+      <w:lvlText w:val="o"/>
+      <w:lvlJc w:val="left"/>
+      <w:pPr>
+        <w:ind w:left="5760" w:hanging="360"/>
+      </w:pPr>
+      <w:rPr>
+        <w:rFonts w:ascii="Courier New" w:hAnsi="Courier New" w:cs="Courier New" w:hint="default"/>
+      </w:rPr>
+    </w:lvl>
+    <w:lvl w:ilvl="8" w:tplc="10090005" w:tentative="1">
+      <w:start w:val="1"/>
+      <w:numFmt w:val="bullet"/>
+      <w:lvlText w:val=""/>
+      <w:lvlJc w:val="left"/>
+      <w:pPr>
+        <w:ind w:left="6480" w:hanging="360"/>
+      </w:pPr>
+      <w:rPr>
+        <w:rFonts w:ascii="Wingdings" w:hAnsi="Wingdings" w:hint="default"/>
+      </w:rPr>
+    </w:lvl>
+  </w:abstractNum>
+  <w:abstractNum w:abstractNumId="12" w15:restartNumberingAfterBreak="0">
+    <w:nsid w:val="68DE4961"/>
+    <w:multiLevelType w:val="hybridMultilevel"/>
+    <w:tmpl w:val="A9104E72"/>
+    <w:lvl w:ilvl="0" w:tplc="10090001">
+      <w:start w:val="1"/>
+      <w:numFmt w:val="bullet"/>
+      <w:lvlText w:val=""/>
+      <w:lvlJc w:val="left"/>
+      <w:pPr>
+        <w:ind w:left="720" w:hanging="360"/>
+      </w:pPr>
+      <w:rPr>
+        <w:rFonts w:ascii="Symbol" w:hAnsi="Symbol" w:hint="default"/>
+      </w:rPr>
+    </w:lvl>
+    <w:lvl w:ilvl="1" w:tplc="10090003" w:tentative="1">
+      <w:start w:val="1"/>
+      <w:numFmt w:val="bullet"/>
+      <w:lvlText w:val="o"/>
+      <w:lvlJc w:val="left"/>
+      <w:pPr>
+        <w:ind w:left="1440" w:hanging="360"/>
+      </w:pPr>
+      <w:rPr>
+        <w:rFonts w:ascii="Courier New" w:hAnsi="Courier New" w:cs="Courier New" w:hint="default"/>
+      </w:rPr>
+    </w:lvl>
+    <w:lvl w:ilvl="2" w:tplc="10090005" w:tentative="1">
+      <w:start w:val="1"/>
+      <w:numFmt w:val="bullet"/>
+      <w:lvlText w:val=""/>
+      <w:lvlJc w:val="left"/>
+      <w:pPr>
+        <w:ind w:left="2160" w:hanging="360"/>
+      </w:pPr>
+      <w:rPr>
+        <w:rFonts w:ascii="Wingdings" w:hAnsi="Wingdings" w:hint="default"/>
+      </w:rPr>
+    </w:lvl>
+    <w:lvl w:ilvl="3" w:tplc="10090001" w:tentative="1">
+      <w:start w:val="1"/>
+      <w:numFmt w:val="bullet"/>
+      <w:lvlText w:val=""/>
+      <w:lvlJc w:val="left"/>
+      <w:pPr>
+        <w:ind w:left="2880" w:hanging="360"/>
+      </w:pPr>
+      <w:rPr>
+        <w:rFonts w:ascii="Symbol" w:hAnsi="Symbol" w:hint="default"/>
+      </w:rPr>
+    </w:lvl>
+    <w:lvl w:ilvl="4" w:tplc="10090003" w:tentative="1">
+      <w:start w:val="1"/>
+      <w:numFmt w:val="bullet"/>
+      <w:lvlText w:val="o"/>
+      <w:lvlJc w:val="left"/>
+      <w:pPr>
+        <w:ind w:left="3600" w:hanging="360"/>
+      </w:pPr>
+      <w:rPr>
+        <w:rFonts w:ascii="Courier New" w:hAnsi="Courier New" w:cs="Courier New" w:hint="default"/>
+      </w:rPr>
+    </w:lvl>
+    <w:lvl w:ilvl="5" w:tplc="10090005" w:tentative="1">
+      <w:start w:val="1"/>
+      <w:numFmt w:val="bullet"/>
+      <w:lvlText w:val=""/>
+      <w:lvlJc w:val="left"/>
+      <w:pPr>
+        <w:ind w:left="4320" w:hanging="360"/>
+      </w:pPr>
+      <w:rPr>
+        <w:rFonts w:ascii="Wingdings" w:hAnsi="Wingdings" w:hint="default"/>
+      </w:rPr>
+    </w:lvl>
+    <w:lvl w:ilvl="6" w:tplc="10090001" w:tentative="1">
+      <w:start w:val="1"/>
+      <w:numFmt w:val="bullet"/>
+      <w:lvlText w:val=""/>
+      <w:lvlJc w:val="left"/>
+      <w:pPr>
+        <w:ind w:left="5040" w:hanging="360"/>
+      </w:pPr>
+      <w:rPr>
+        <w:rFonts w:ascii="Symbol" w:hAnsi="Symbol" w:hint="default"/>
+      </w:rPr>
+    </w:lvl>
+    <w:lvl w:ilvl="7" w:tplc="10090003" w:tentative="1">
+      <w:start w:val="1"/>
+      <w:numFmt w:val="bullet"/>
+      <w:lvlText w:val="o"/>
+      <w:lvlJc w:val="left"/>
+      <w:pPr>
+        <w:ind w:left="5760" w:hanging="360"/>
+      </w:pPr>
+      <w:rPr>
+        <w:rFonts w:ascii="Courier New" w:hAnsi="Courier New" w:cs="Courier New" w:hint="default"/>
+      </w:rPr>
+    </w:lvl>
+    <w:lvl w:ilvl="8" w:tplc="10090005" w:tentative="1">
+      <w:start w:val="1"/>
+      <w:numFmt w:val="bullet"/>
+      <w:lvlText w:val=""/>
+      <w:lvlJc w:val="left"/>
+      <w:pPr>
+        <w:ind w:left="6480" w:hanging="360"/>
+      </w:pPr>
+      <w:rPr>
+        <w:rFonts w:ascii="Wingdings" w:hAnsi="Wingdings" w:hint="default"/>
+      </w:rPr>
+    </w:lvl>
+  </w:abstractNum>
+  <w:abstractNum w:abstractNumId="13" w15:restartNumberingAfterBreak="0">
+    <w:nsid w:val="6E410405"/>
+    <w:multiLevelType w:val="hybridMultilevel"/>
+    <w:tmpl w:val="DEF4BB72"/>
+    <w:lvl w:ilvl="0" w:tplc="10090001">
+      <w:start w:val="1"/>
+      <w:numFmt w:val="bullet"/>
+      <w:lvlText w:val=""/>
+      <w:lvlJc w:val="left"/>
+      <w:pPr>
+        <w:ind w:left="720" w:hanging="360"/>
+      </w:pPr>
+      <w:rPr>
+        <w:rFonts w:ascii="Symbol" w:hAnsi="Symbol" w:hint="default"/>
+      </w:rPr>
+    </w:lvl>
+    <w:lvl w:ilvl="1" w:tplc="10090003" w:tentative="1">
+      <w:start w:val="1"/>
+      <w:numFmt w:val="bullet"/>
+      <w:lvlText w:val="o"/>
+      <w:lvlJc w:val="left"/>
+      <w:pPr>
+        <w:ind w:left="1440" w:hanging="360"/>
+      </w:pPr>
+      <w:rPr>
+        <w:rFonts w:ascii="Courier New" w:hAnsi="Courier New" w:cs="Courier New" w:hint="default"/>
+      </w:rPr>
+    </w:lvl>
+    <w:lvl w:ilvl="2" w:tplc="10090005" w:tentative="1">
+      <w:start w:val="1"/>
+      <w:numFmt w:val="bullet"/>
+      <w:lvlText w:val=""/>
+      <w:lvlJc w:val="left"/>
+      <w:pPr>
+        <w:ind w:left="2160" w:hanging="360"/>
+      </w:pPr>
+      <w:rPr>
+        <w:rFonts w:ascii="Wingdings" w:hAnsi="Wingdings" w:hint="default"/>
+      </w:rPr>
+    </w:lvl>
+    <w:lvl w:ilvl="3" w:tplc="10090001" w:tentative="1">
+      <w:start w:val="1"/>
+      <w:numFmt w:val="bullet"/>
+      <w:lvlText w:val=""/>
+      <w:lvlJc w:val="left"/>
+      <w:pPr>
+        <w:ind w:left="2880" w:hanging="360"/>
+      </w:pPr>
+      <w:rPr>
+        <w:rFonts w:ascii="Symbol" w:hAnsi="Symbol" w:hint="default"/>
+      </w:rPr>
+    </w:lvl>
+    <w:lvl w:ilvl="4" w:tplc="10090003" w:tentative="1">
+      <w:start w:val="1"/>
+      <w:numFmt w:val="bullet"/>
+      <w:lvlText w:val="o"/>
+      <w:lvlJc w:val="left"/>
+      <w:pPr>
+        <w:ind w:left="3600" w:hanging="360"/>
+      </w:pPr>
+      <w:rPr>
+        <w:rFonts w:ascii="Courier New" w:hAnsi="Courier New" w:cs="Courier New" w:hint="default"/>
+      </w:rPr>
+    </w:lvl>
+    <w:lvl w:ilvl="5" w:tplc="10090005" w:tentative="1">
+      <w:start w:val="1"/>
+      <w:numFmt w:val="bullet"/>
+      <w:lvlText w:val=""/>
+      <w:lvlJc w:val="left"/>
+      <w:pPr>
+        <w:ind w:left="4320" w:hanging="360"/>
+      </w:pPr>
+      <w:rPr>
+        <w:rFonts w:ascii="Wingdings" w:hAnsi="Wingdings" w:hint="default"/>
+      </w:rPr>
+    </w:lvl>
+    <w:lvl w:ilvl="6" w:tplc="10090001" w:tentative="1">
+      <w:start w:val="1"/>
+      <w:numFmt w:val="bullet"/>
+      <w:lvlText w:val=""/>
+      <w:lvlJc w:val="left"/>
+      <w:pPr>
+        <w:ind w:left="5040" w:hanging="360"/>
+      </w:pPr>
+      <w:rPr>
+        <w:rFonts w:ascii="Symbol" w:hAnsi="Symbol" w:hint="default"/>
+      </w:rPr>
+    </w:lvl>
+    <w:lvl w:ilvl="7" w:tplc="10090003" w:tentative="1">
+      <w:start w:val="1"/>
+      <w:numFmt w:val="bullet"/>
+      <w:lvlText w:val="o"/>
+      <w:lvlJc w:val="left"/>
+      <w:pPr>
+        <w:ind w:left="5760" w:hanging="360"/>
+      </w:pPr>
+      <w:rPr>
+        <w:rFonts w:ascii="Courier New" w:hAnsi="Courier New" w:cs="Courier New" w:hint="default"/>
+      </w:rPr>
+    </w:lvl>
+    <w:lvl w:ilvl="8" w:tplc="10090005" w:tentative="1">
+      <w:start w:val="1"/>
+      <w:numFmt w:val="bullet"/>
+      <w:lvlText w:val=""/>
+      <w:lvlJc w:val="left"/>
+      <w:pPr>
+        <w:ind w:left="6480" w:hanging="360"/>
+      </w:pPr>
+      <w:rPr>
+        <w:rFonts w:ascii="Wingdings" w:hAnsi="Wingdings" w:hint="default"/>
+      </w:rPr>
+    </w:lvl>
+  </w:abstractNum>
+  <w:abstractNum w:abstractNumId="14" w15:restartNumberingAfterBreak="0">
     <w:nsid w:val="6F0C62FC"/>
     <w:multiLevelType w:val="hybridMultilevel"/>
     <w:tmpl w:val="55D67A3E"/>
@@ -1523,7 +2601,7 @@
       </w:rPr>
     </w:lvl>
   </w:abstractNum>
-  <w:abstractNum w:abstractNumId="8" w15:restartNumberingAfterBreak="0">
+  <w:abstractNum w:abstractNumId="15" w15:restartNumberingAfterBreak="0">
     <w:nsid w:val="7CB20A36"/>
     <w:multiLevelType w:val="hybridMultilevel"/>
     <w:tmpl w:val="D870C6D0"/>
@@ -1635,7 +2713,7 @@
       </w:rPr>
     </w:lvl>
   </w:abstractNum>
-  <w:abstractNum w:abstractNumId="9" w15:restartNumberingAfterBreak="0">
+  <w:abstractNum w:abstractNumId="16" w15:restartNumberingAfterBreak="0">
     <w:nsid w:val="7E4A2C6A"/>
     <w:multiLevelType w:val="hybridMultilevel"/>
     <w:tmpl w:val="3C74B7F0"/>
@@ -1749,34 +2827,55 @@
     </w:lvl>
   </w:abstractNum>
   <w:num w:numId="1">
-    <w:abstractNumId w:val="4"/>
+    <w:abstractNumId w:val="6"/>
   </w:num>
   <w:num w:numId="2">
-    <w:abstractNumId w:val="6"/>
+    <w:abstractNumId w:val="10"/>
   </w:num>
   <w:num w:numId="3">
+    <w:abstractNumId w:val="3"/>
+  </w:num>
+  <w:num w:numId="4">
+    <w:abstractNumId w:val="14"/>
+  </w:num>
+  <w:num w:numId="5">
+    <w:abstractNumId w:val="8"/>
+  </w:num>
+  <w:num w:numId="6">
     <w:abstractNumId w:val="2"/>
   </w:num>
-  <w:num w:numId="4">
+  <w:num w:numId="7">
+    <w:abstractNumId w:val="1"/>
+  </w:num>
+  <w:num w:numId="8">
+    <w:abstractNumId w:val="16"/>
+  </w:num>
+  <w:num w:numId="9">
+    <w:abstractNumId w:val="15"/>
+  </w:num>
+  <w:num w:numId="10">
+    <w:abstractNumId w:val="5"/>
+  </w:num>
+  <w:num w:numId="11">
+    <w:abstractNumId w:val="0"/>
+  </w:num>
+  <w:num w:numId="12">
+    <w:abstractNumId w:val="13"/>
+  </w:num>
+  <w:num w:numId="13">
+    <w:abstractNumId w:val="11"/>
+  </w:num>
+  <w:num w:numId="14">
+    <w:abstractNumId w:val="12"/>
+  </w:num>
+  <w:num w:numId="15">
     <w:abstractNumId w:val="7"/>
   </w:num>
-  <w:num w:numId="5">
-    <w:abstractNumId w:val="5"/>
-  </w:num>
-  <w:num w:numId="6">
-    <w:abstractNumId w:val="1"/>
-  </w:num>
-  <w:num w:numId="7">
-    <w:abstractNumId w:val="0"/>
-  </w:num>
-  <w:num w:numId="8">
+  <w:num w:numId="16">
     <w:abstractNumId w:val="9"/>
   </w:num>
-  <w:num w:numId="9">
-    <w:abstractNumId w:val="8"/>
-  </w:num>
-  <w:num w:numId="10">
-    <w:abstractNumId w:val="3"/>
+  <w:num w:numId="17">
+    <w:abstractNumId w:val="4"/>
   </w:num>
 </w:numbering>
 </file>

</xml_diff>